<commit_message>
docs: calibracao dos pesos da RN03 por simulacao (w1 = 0,6) e criterio de escolha
</commit_message>
<xml_diff>
--- a/docs/requisitos/GASTRA_KPIs_Criterios_Analiticos.docx
+++ b/docs/requisitos/GASTRA_KPIs_Criterios_Analiticos.docx
@@ -182,11 +182,9 @@
         <w:spacing w:after="80"/>
       </w:pPr>
       <w:r>
-        <w:t>Fator 1 — equilíbrio do faturamento acumulado por garçom, ponderado pelo faturamento médio histórico da praça</w:t>
-      </w:r>
-      <w:r>
-        <w:t>.</w:t>
-      </w:r>
+        <w:t>Fator 1 — equilíbrio do faturamento médio por turno trabalhado de cada garçom (últimos 30 dias), ponderado pelo faturamento médio histórico da praça.</w:t>
+      </w:r>
+      <w:r/>
     </w:p>
     <w:p>
       <w:pPr>
@@ -432,7 +430,7 @@
         <w:spacing w:after="150"/>
       </w:pPr>
       <w:r>
-        <w:t>Pendente: os valores numéricos de w1 e w2 serão calibrados com dado simulado, junto com a decisão de qual métrica de equidade usar para comparar diferentes combinações de pesos (ex.: variância do faturamento acumulado entre garçons ao longo de N turnos simulados, ou coeficiente de Gini).</w:t>
+        <w:t>Calibração (issue #55): w1 = 0,6 e w2 = 0,4, definidos por simulação de 120 turnos em 20 sementes, com a mesma programação linear do sistema. Métrica principal: coeficiente de Gini do faturamento médio por turno trabalhado; secundária: espera máxima sem praça de alto potencial. Escolhe-se o menor w1 cujo Gini fica até 50% acima do menor obtido. A calibração também mostrou que o Fator 1 deve usar o faturamento médio por turno, e não o acumulado: com a soma, quem falta mais parece estar para trás e recebe praça boa por isso. Detalhes: docs/analises/GASTRA_Calibracao_Pesos_RN03.md.</w:t>
       </w:r>
     </w:p>
     <w:p>

</xml_diff>

<commit_message>
feat(analitica): clusterização por perfil de consumo e recomendação segmentada (RF09)
- Perfis de consumo plantados no simulador e no semeador (executivo, frutos do mar, família), escolhidos
  por período e pessoas; é o gabarito da clusterização, como a combinação moqueca -> arroz é o das regras.
- K-Means sobre os itens pedidos (cosseno), quantidade de perfis pela silhueta (2 a 6, mínimo 0,25).
- Recomendação segmentada: regras do perfil, itens característicos dele e regras gerais.
- GET /clusterizacao/perfis e o perfil usado na resposta da recomendação.
- Validação sobre banco semeado separado, por script: 3 perfis (silhueta 0,387), acerto 83,2% contra 76,2%.

Refs #240
</commit_message>
<xml_diff>
--- a/docs/requisitos/GASTRA_KPIs_Criterios_Analiticos.docx
+++ b/docs/requisitos/GASTRA_KPIs_Criterios_Analiticos.docx
@@ -622,7 +622,7 @@
         <w:spacing w:after="80"/>
       </w:pPr>
       <w:r>
-        <w:t>Regras de associação: limiares mínimos de suporte e confiança — a calibrar quando houver volume de dado suficiente.</w:t>
+        <w:t xml:space="preserve">Regras de associação (Apriori): suporte mínimo de 5%, confiança mínima de 30% e lift acima de 1; com menos de 50 comandas de dois itens ou mais no histórico real, o serviço usa o histórico simulado e informa o motivo.</w:t>
       </w:r>
     </w:p>
     <w:p>
@@ -634,7 +634,7 @@
         <w:spacing w:after="80"/>
       </w:pPr>
       <w:r>
-        <w:t>Clusterização por padrão de consumo observável (nunca atributo sensível); número de clusters a definir experimentalmente.</w:t>
+        <w:t xml:space="preserve">Clusterização por padrão de consumo observável (nunca atributo sensível, RN05): K-Means sobre os itens pedidos em cada comanda, com vetores normalizados (similaridade do cosseno); a quantidade de perfis é escolhida entre 2 e 6 pelo maior coeficiente de silhueta, e abaixo de 0,25 considera-se que não há perfis. A recomendação é segmentada: a comanda em andamento é associada ao perfil mais parecido e recebe as regras do perfil, os itens característicos dele e as regras gerais. Validação sobre o banco semeado: 3 perfis (silhueta 0,387) e acerto de 83,2% contra 76,2% das regras gerais (#240).</w:t>
       </w:r>
     </w:p>
     <w:p/>

</xml_diff>